<commit_message>
Yayinevine gonderilmis Enerji bolum sonu soru dosyasi gonderildigi haline geri dondu (duzeltmeler dizilmis nushada yapilacak)
</commit_message>
<xml_diff>
--- a/sorular/Kim11_tema-1-Enerji-bolum-sonu-sorular-4-6-2026.docx
+++ b/sorular/Kim11_tema-1-Enerji-bolum-sonu-sorular-4-6-2026.docx
@@ -1600,21 +1600,16 @@
     <w:p>
       <w:pPr>
         <w:pStyle w:val="ListParagraph"/>
-        <w:ind w:left="1080" w:hanging="360"/>
+        <w:numPr>
+          <w:ilvl w:val="0"/>
+          <w:numId w:val="24"/>
+        </w:numPr>
         <w:jc w:val="both"/>
         <w:rPr>
           <w:rFonts w:ascii="Times New Roman" w:hAnsi="Times New Roman" w:cs="Times New Roman"/>
           <w:lang w:val="tr-TR"/>
         </w:rPr>
       </w:pPr>
-      <w:r>
-        <w:rPr>
-          <w:rFonts w:ascii="Times New Roman" w:hAnsi="Times New Roman" w:cs="Times New Roman"/>
-          <w:lang w:val="tr-TR"/>
-        </w:rPr>
-        <w:t xml:space="preserve">a.</w:t>
-        <w:tab/>
-      </w:r>
       <w:r>
         <w:rPr>
           <w:rFonts w:ascii="Times New Roman" w:hAnsi="Times New Roman" w:cs="Times New Roman"/>
@@ -1803,21 +1798,16 @@
     <w:p>
       <w:pPr>
         <w:pStyle w:val="ListParagraph"/>
-        <w:ind w:left="1080" w:hanging="360"/>
+        <w:numPr>
+          <w:ilvl w:val="0"/>
+          <w:numId w:val="24"/>
+        </w:numPr>
         <w:jc w:val="both"/>
         <w:rPr>
           <w:rFonts w:ascii="Times New Roman" w:hAnsi="Times New Roman" w:cs="Times New Roman"/>
           <w:lang w:val="tr-TR"/>
         </w:rPr>
       </w:pPr>
-      <w:r>
-        <w:rPr>
-          <w:rFonts w:ascii="Times New Roman" w:hAnsi="Times New Roman" w:cs="Times New Roman"/>
-          <w:lang w:val="tr-TR"/>
-        </w:rPr>
-        <w:t xml:space="preserve">b.</w:t>
-        <w:tab/>
-      </w:r>
       <w:r>
         <w:rPr>
           <w:rFonts w:ascii="Times New Roman" w:hAnsi="Times New Roman" w:cs="Times New Roman"/>
@@ -2014,21 +2004,16 @@
     <w:p>
       <w:pPr>
         <w:pStyle w:val="ListParagraph"/>
-        <w:ind w:left="1080" w:hanging="360"/>
+        <w:numPr>
+          <w:ilvl w:val="0"/>
+          <w:numId w:val="24"/>
+        </w:numPr>
         <w:jc w:val="both"/>
         <w:rPr>
           <w:rFonts w:ascii="Times New Roman" w:hAnsi="Times New Roman" w:cs="Times New Roman"/>
           <w:lang w:val="tr-TR"/>
         </w:rPr>
       </w:pPr>
-      <w:r>
-        <w:rPr>
-          <w:rFonts w:ascii="Times New Roman" w:hAnsi="Times New Roman" w:cs="Times New Roman"/>
-          <w:lang w:val="tr-TR"/>
-        </w:rPr>
-        <w:t xml:space="preserve">c.</w:t>
-        <w:tab/>
-      </w:r>
       <w:r>
         <w:rPr>
           <w:rFonts w:ascii="Times New Roman" w:hAnsi="Times New Roman" w:cs="Times New Roman"/>
@@ -2159,21 +2144,16 @@
     <w:p>
       <w:pPr>
         <w:pStyle w:val="ListParagraph"/>
-        <w:ind w:left="720" w:hanging="360"/>
+        <w:numPr>
+          <w:ilvl w:val="0"/>
+          <w:numId w:val="26"/>
+        </w:numPr>
         <w:jc w:val="both"/>
         <w:rPr>
           <w:rFonts w:ascii="Times New Roman" w:hAnsi="Times New Roman" w:cs="Times New Roman"/>
           <w:lang w:val="tr-TR"/>
         </w:rPr>
       </w:pPr>
-      <w:r>
-        <w:rPr>
-          <w:rFonts w:ascii="Times New Roman" w:hAnsi="Times New Roman" w:cs="Times New Roman"/>
-          <w:lang w:val="tr-TR"/>
-        </w:rPr>
-        <w:t xml:space="preserve">a.</w:t>
-        <w:tab/>
-      </w:r>
       <w:r>
         <w:rPr>
           <w:rFonts w:ascii="Times New Roman" w:hAnsi="Times New Roman" w:cs="Times New Roman"/>
@@ -2475,7 +2455,10 @@
     <w:p>
       <w:pPr>
         <w:pStyle w:val="ListParagraph"/>
-        <w:ind w:left="720" w:hanging="360"/>
+        <w:numPr>
+          <w:ilvl w:val="0"/>
+          <w:numId w:val="26"/>
+        </w:numPr>
         <w:jc w:val="both"/>
         <w:rPr>
           <w:rFonts w:ascii="Times New Roman" w:hAnsi="Times New Roman" w:cs="Times New Roman"/>
@@ -2601,14 +2584,6 @@
           <w:rFonts w:ascii="Times New Roman" w:hAnsi="Times New Roman" w:cs="Times New Roman"/>
           <w:lang w:val="tr-TR"/>
         </w:rPr>
-        <w:t xml:space="preserve">b.</w:t>
-        <w:tab/>
-      </w:r>
-      <w:r>
-        <w:rPr>
-          <w:rFonts w:ascii="Times New Roman" w:hAnsi="Times New Roman" w:cs="Times New Roman"/>
-          <w:lang w:val="tr-TR"/>
-        </w:rPr>
         <w:t>H</w:t>
       </w:r>
       <w:r>
@@ -2717,21 +2692,16 @@
     <w:p>
       <w:pPr>
         <w:pStyle w:val="ListParagraph"/>
-        <w:ind w:left="720" w:hanging="360"/>
+        <w:numPr>
+          <w:ilvl w:val="0"/>
+          <w:numId w:val="26"/>
+        </w:numPr>
         <w:jc w:val="both"/>
         <w:rPr>
           <w:rFonts w:ascii="Times New Roman" w:hAnsi="Times New Roman" w:cs="Times New Roman"/>
           <w:lang w:val="tr-TR"/>
         </w:rPr>
       </w:pPr>
-      <w:r>
-        <w:rPr>
-          <w:rFonts w:ascii="Times New Roman" w:hAnsi="Times New Roman" w:cs="Times New Roman"/>
-          <w:lang w:val="tr-TR"/>
-        </w:rPr>
-        <w:t xml:space="preserve">c.</w:t>
-        <w:tab/>
-      </w:r>
       <w:r>
         <w:rPr>
           <w:rFonts w:ascii="Times New Roman" w:hAnsi="Times New Roman" w:cs="Times New Roman"/>
@@ -3085,20 +3055,15 @@
     <w:p>
       <w:pPr>
         <w:pStyle w:val="ListParagraph"/>
-        <w:ind w:left="720" w:hanging="360"/>
-        <w:rPr>
-          <w:rFonts w:ascii="Times New Roman" w:hAnsi="Times New Roman" w:cs="Times New Roman"/>
-          <w:lang w:val="tr-TR"/>
-        </w:rPr>
-      </w:pPr>
-      <w:r>
-        <w:rPr>
-          <w:rFonts w:ascii="Times New Roman" w:hAnsi="Times New Roman" w:cs="Times New Roman"/>
-          <w:lang w:val="tr-TR"/>
-        </w:rPr>
-        <w:t xml:space="preserve">a.</w:t>
-        <w:tab/>
-      </w:r>
+        <w:numPr>
+          <w:ilvl w:val="0"/>
+          <w:numId w:val="27"/>
+        </w:numPr>
+        <w:rPr>
+          <w:rFonts w:ascii="Times New Roman" w:hAnsi="Times New Roman" w:cs="Times New Roman"/>
+          <w:lang w:val="tr-TR"/>
+        </w:rPr>
+      </w:pPr>
       <w:r>
         <w:rPr>
           <w:rFonts w:ascii="Times New Roman" w:hAnsi="Times New Roman" w:cs="Times New Roman"/>
@@ -3420,21 +3385,16 @@
     <w:p>
       <w:pPr>
         <w:pStyle w:val="ListParagraph"/>
-        <w:ind w:left="720" w:hanging="360"/>
+        <w:numPr>
+          <w:ilvl w:val="0"/>
+          <w:numId w:val="27"/>
+        </w:numPr>
         <w:jc w:val="both"/>
         <w:rPr>
           <w:rFonts w:ascii="Times New Roman" w:hAnsi="Times New Roman" w:cs="Times New Roman"/>
           <w:lang w:val="tr-TR"/>
         </w:rPr>
       </w:pPr>
-      <w:r>
-        <w:rPr>
-          <w:rFonts w:ascii="Times New Roman" w:hAnsi="Times New Roman" w:cs="Times New Roman"/>
-          <w:lang w:val="tr-TR"/>
-        </w:rPr>
-        <w:t xml:space="preserve">b.</w:t>
-        <w:tab/>
-      </w:r>
       <w:r>
         <w:rPr>
           <w:rFonts w:ascii="Times New Roman" w:hAnsi="Times New Roman" w:cs="Times New Roman"/>
@@ -3719,21 +3679,16 @@
     <w:p>
       <w:pPr>
         <w:pStyle w:val="ListParagraph"/>
-        <w:ind w:left="720" w:hanging="360"/>
+        <w:numPr>
+          <w:ilvl w:val="0"/>
+          <w:numId w:val="27"/>
+        </w:numPr>
         <w:jc w:val="both"/>
         <w:rPr>
           <w:rFonts w:ascii="Times New Roman" w:hAnsi="Times New Roman" w:cs="Times New Roman"/>
           <w:lang w:val="tr-TR"/>
         </w:rPr>
       </w:pPr>
-      <w:r>
-        <w:rPr>
-          <w:rFonts w:ascii="Times New Roman" w:hAnsi="Times New Roman" w:cs="Times New Roman"/>
-          <w:lang w:val="tr-TR"/>
-        </w:rPr>
-        <w:t xml:space="preserve">c.</w:t>
-        <w:tab/>
-      </w:r>
       <w:r>
         <w:rPr>
           <w:rFonts w:ascii="Times New Roman" w:hAnsi="Times New Roman" w:cs="Times New Roman"/>

</xml_diff>